<commit_message>
perfect for 1st Phase Release
</commit_message>
<xml_diff>
--- a/Instructions.docx
+++ b/Instructions.docx
@@ -3158,6 +3158,35 @@
         </w:tc>
       </w:tr>
     </w:tbl>
+    <w:p/>
+    <w:p/>
+    <w:p/>
+    <w:p>
+      <w:r>
+        <w:t xml:space="preserve">1. </w:t>
+      </w:r>
+      <w:proofErr w:type="gramStart"/>
+      <w:r>
+        <w:t>one</w:t>
+      </w:r>
+      <w:proofErr w:type="gramEnd"/>
+      <w:r>
+        <w:t xml:space="preserve"> entry per month  if someone wants to update there should be option in data entry form </w:t>
+      </w:r>
+    </w:p>
+    <w:p>
+      <w:r>
+        <w:t xml:space="preserve">2. What should be target in action </w:t>
+      </w:r>
+      <w:proofErr w:type="gramStart"/>
+      <w:r>
+        <w:t>tracker ?</w:t>
+      </w:r>
+      <w:proofErr w:type="gramEnd"/>
+      <w:r>
+        <w:t xml:space="preserve"> it should be decided by DC and enter it then next month he should be able to see target decided in previous month/quarter  whether its completed or not how much is deviation </w:t>
+      </w:r>
+    </w:p>
     <w:p/>
     <w:sectPr>
       <w:pgSz w:w="11906" w:h="16838"/>
@@ -3651,7 +3680,7 @@
   <a:extraClrSchemeLst/>
   <a:extLst>
     <a:ext uri="{05A4C25C-085E-4340-85A3-A5531E510DB2}">
-      <thm15:themeFamily xmlns:thm15="http://schemas.microsoft.com/office/thememl/2012/main" xmlns="" name="Office Theme" id="{62F939B6-93AF-4DB8-9C6B-D6C7DFDC589F}" vid="{4A3C46E8-61CC-4603-A589-7422A47A8E4A}"/>
+      <thm15:themeFamily xmlns="" xmlns:thm15="http://schemas.microsoft.com/office/thememl/2012/main" name="Office Theme" id="{62F939B6-93AF-4DB8-9C6B-D6C7DFDC589F}" vid="{4A3C46E8-61CC-4603-A589-7422A47A8E4A}"/>
     </a:ext>
   </a:extLst>
 </a:theme>

</xml_diff>